<commit_message>
final implementation of project structure and functionalities
</commit_message>
<xml_diff>
--- a/Esey/PREDLOŽAK KV1.docx
+++ b/Esey/PREDLOŽAK KV1.docx
@@ -70,440 +70,6 @@
         <w:t>zadatak</w:t>
       </w:r>
       <w:proofErr w:type="spellEnd"/>
-    </w:p>
-    <w:p>
-      <w:pPr>
-        <w:spacing w:before="240" w:after="240"/>
-      </w:pPr>
-      <w:r>
-        <w:t>[</w:t>
-      </w:r>
-      <w:proofErr w:type="spellStart"/>
-      <w:r>
-        <w:t>Opisati</w:t>
-      </w:r>
-      <w:proofErr w:type="spellEnd"/>
-      <w:r>
-        <w:t xml:space="preserve"> </w:t>
-      </w:r>
-      <w:proofErr w:type="spellStart"/>
-      <w:r>
-        <w:t>glavni</w:t>
-      </w:r>
-      <w:proofErr w:type="spellEnd"/>
-      <w:r>
-        <w:t xml:space="preserve"> </w:t>
-      </w:r>
-      <w:proofErr w:type="spellStart"/>
-      <w:r>
-        <w:t>cilj</w:t>
-      </w:r>
-      <w:proofErr w:type="spellEnd"/>
-      <w:r>
-        <w:t xml:space="preserve"> </w:t>
-      </w:r>
-      <w:proofErr w:type="spellStart"/>
-      <w:r>
-        <w:t>projekta</w:t>
-      </w:r>
-      <w:proofErr w:type="spellEnd"/>
-      <w:r>
-        <w:t xml:space="preserve"> </w:t>
-      </w:r>
-      <w:proofErr w:type="spellStart"/>
-      <w:r>
-        <w:t>i</w:t>
-      </w:r>
-      <w:proofErr w:type="spellEnd"/>
-      <w:r>
-        <w:t xml:space="preserve"> </w:t>
-      </w:r>
-      <w:proofErr w:type="spellStart"/>
-      <w:r>
-        <w:t>svrhu</w:t>
-      </w:r>
-      <w:proofErr w:type="spellEnd"/>
-      <w:r>
-        <w:t xml:space="preserve"> </w:t>
-      </w:r>
-      <w:proofErr w:type="spellStart"/>
-      <w:r>
-        <w:t>vizualizacije</w:t>
-      </w:r>
-      <w:proofErr w:type="spellEnd"/>
-      <w:r>
-        <w:t xml:space="preserve"> </w:t>
-      </w:r>
-      <w:proofErr w:type="spellStart"/>
-      <w:r>
-        <w:t>podataka</w:t>
-      </w:r>
-      <w:proofErr w:type="spellEnd"/>
-      <w:r>
-        <w:t>.</w:t>
-      </w:r>
-      <w:r>
-        <w:br/>
-      </w:r>
-      <w:proofErr w:type="spellStart"/>
-      <w:r>
-        <w:rPr>
-          <w:i/>
-        </w:rPr>
-        <w:t>Ovaj</w:t>
-      </w:r>
-      <w:proofErr w:type="spellEnd"/>
-      <w:r>
-        <w:rPr>
-          <w:i/>
-        </w:rPr>
-        <w:t xml:space="preserve"> </w:t>
-      </w:r>
-      <w:proofErr w:type="spellStart"/>
-      <w:r>
-        <w:rPr>
-          <w:i/>
-        </w:rPr>
-        <w:t>zadatak</w:t>
-      </w:r>
-      <w:proofErr w:type="spellEnd"/>
-      <w:r>
-        <w:rPr>
-          <w:i/>
-        </w:rPr>
-        <w:t xml:space="preserve"> </w:t>
-      </w:r>
-      <w:proofErr w:type="spellStart"/>
-      <w:r>
-        <w:rPr>
-          <w:i/>
-        </w:rPr>
-        <w:t>zahtijeva</w:t>
-      </w:r>
-      <w:proofErr w:type="spellEnd"/>
-      <w:r>
-        <w:rPr>
-          <w:i/>
-        </w:rPr>
-        <w:t xml:space="preserve"> </w:t>
-      </w:r>
-      <w:proofErr w:type="spellStart"/>
-      <w:r>
-        <w:rPr>
-          <w:i/>
-        </w:rPr>
-        <w:t>jasno</w:t>
-      </w:r>
-      <w:proofErr w:type="spellEnd"/>
-      <w:r>
-        <w:rPr>
-          <w:i/>
-        </w:rPr>
-        <w:t xml:space="preserve"> </w:t>
-      </w:r>
-      <w:r>
-        <w:rPr>
-          <w:i/>
-        </w:rPr>
-        <w:tab/>
-      </w:r>
-      <w:proofErr w:type="spellStart"/>
-      <w:r>
-        <w:rPr>
-          <w:i/>
-        </w:rPr>
-        <w:t>definiranje</w:t>
-      </w:r>
-      <w:proofErr w:type="spellEnd"/>
-      <w:r>
-        <w:rPr>
-          <w:i/>
-        </w:rPr>
-        <w:t xml:space="preserve"> </w:t>
-      </w:r>
-      <w:proofErr w:type="spellStart"/>
-      <w:r>
-        <w:rPr>
-          <w:i/>
-        </w:rPr>
-        <w:t>problema</w:t>
-      </w:r>
-      <w:proofErr w:type="spellEnd"/>
-      <w:r>
-        <w:rPr>
-          <w:i/>
-        </w:rPr>
-        <w:t xml:space="preserve"> koji se </w:t>
-      </w:r>
-      <w:proofErr w:type="spellStart"/>
-      <w:r>
-        <w:rPr>
-          <w:i/>
-        </w:rPr>
-        <w:t>pokušava</w:t>
-      </w:r>
-      <w:proofErr w:type="spellEnd"/>
-      <w:r>
-        <w:rPr>
-          <w:i/>
-        </w:rPr>
-        <w:t xml:space="preserve"> </w:t>
-      </w:r>
-      <w:proofErr w:type="spellStart"/>
-      <w:r>
-        <w:rPr>
-          <w:i/>
-        </w:rPr>
-        <w:t>riješiti</w:t>
-      </w:r>
-      <w:proofErr w:type="spellEnd"/>
-      <w:r>
-        <w:rPr>
-          <w:i/>
-        </w:rPr>
-        <w:t xml:space="preserve">. </w:t>
-      </w:r>
-      <w:proofErr w:type="spellStart"/>
-      <w:r>
-        <w:rPr>
-          <w:i/>
-        </w:rPr>
-        <w:t>Potrebno</w:t>
-      </w:r>
-      <w:proofErr w:type="spellEnd"/>
-      <w:r>
-        <w:rPr>
-          <w:i/>
-        </w:rPr>
-        <w:t xml:space="preserve"> je </w:t>
-      </w:r>
-      <w:proofErr w:type="spellStart"/>
-      <w:r>
-        <w:rPr>
-          <w:i/>
-        </w:rPr>
-        <w:t>postaviti</w:t>
-      </w:r>
-      <w:proofErr w:type="spellEnd"/>
-      <w:r>
-        <w:rPr>
-          <w:i/>
-        </w:rPr>
-        <w:t xml:space="preserve"> </w:t>
-      </w:r>
-      <w:proofErr w:type="spellStart"/>
-      <w:r>
-        <w:rPr>
-          <w:i/>
-        </w:rPr>
-        <w:t>jasne</w:t>
-      </w:r>
-      <w:proofErr w:type="spellEnd"/>
-      <w:r>
-        <w:rPr>
-          <w:i/>
-        </w:rPr>
-        <w:t xml:space="preserve"> </w:t>
-      </w:r>
-      <w:proofErr w:type="spellStart"/>
-      <w:r>
-        <w:rPr>
-          <w:i/>
-        </w:rPr>
-        <w:t>ciljeve</w:t>
-      </w:r>
-      <w:proofErr w:type="spellEnd"/>
-      <w:r>
-        <w:rPr>
-          <w:i/>
-        </w:rPr>
-        <w:t xml:space="preserve"> </w:t>
-      </w:r>
-      <w:proofErr w:type="spellStart"/>
-      <w:r>
-        <w:rPr>
-          <w:i/>
-        </w:rPr>
-        <w:t>i</w:t>
-      </w:r>
-      <w:proofErr w:type="spellEnd"/>
-      <w:r>
-        <w:rPr>
-          <w:i/>
-        </w:rPr>
-        <w:t xml:space="preserve"> </w:t>
-      </w:r>
-      <w:proofErr w:type="spellStart"/>
-      <w:r>
-        <w:rPr>
-          <w:i/>
-        </w:rPr>
-        <w:t>granice</w:t>
-      </w:r>
-      <w:proofErr w:type="spellEnd"/>
-      <w:r>
-        <w:rPr>
-          <w:i/>
-        </w:rPr>
-        <w:t xml:space="preserve"> </w:t>
-      </w:r>
-      <w:proofErr w:type="spellStart"/>
-      <w:r>
-        <w:rPr>
-          <w:i/>
-        </w:rPr>
-        <w:t>projekta</w:t>
-      </w:r>
-      <w:proofErr w:type="spellEnd"/>
-      <w:r>
-        <w:rPr>
-          <w:i/>
-        </w:rPr>
-        <w:t xml:space="preserve">, </w:t>
-      </w:r>
-      <w:proofErr w:type="spellStart"/>
-      <w:r>
-        <w:rPr>
-          <w:i/>
-        </w:rPr>
-        <w:t>kao</w:t>
-      </w:r>
-      <w:proofErr w:type="spellEnd"/>
-      <w:r>
-        <w:rPr>
-          <w:i/>
-        </w:rPr>
-        <w:t xml:space="preserve"> </w:t>
-      </w:r>
-      <w:proofErr w:type="spellStart"/>
-      <w:r>
-        <w:rPr>
-          <w:i/>
-        </w:rPr>
-        <w:t>i</w:t>
-      </w:r>
-      <w:proofErr w:type="spellEnd"/>
-      <w:r>
-        <w:rPr>
-          <w:i/>
-        </w:rPr>
-        <w:t xml:space="preserve"> </w:t>
-      </w:r>
-      <w:proofErr w:type="spellStart"/>
-      <w:r>
-        <w:rPr>
-          <w:i/>
-        </w:rPr>
-        <w:t>odrediti</w:t>
-      </w:r>
-      <w:proofErr w:type="spellEnd"/>
-      <w:r>
-        <w:rPr>
-          <w:i/>
-        </w:rPr>
-        <w:t xml:space="preserve"> koji </w:t>
-      </w:r>
-      <w:proofErr w:type="spellStart"/>
-      <w:r>
-        <w:rPr>
-          <w:i/>
-        </w:rPr>
-        <w:t>će</w:t>
-      </w:r>
-      <w:proofErr w:type="spellEnd"/>
-      <w:r>
-        <w:rPr>
-          <w:i/>
-        </w:rPr>
-        <w:t xml:space="preserve"> se </w:t>
-      </w:r>
-      <w:proofErr w:type="spellStart"/>
-      <w:r>
-        <w:rPr>
-          <w:i/>
-        </w:rPr>
-        <w:t>podaci</w:t>
-      </w:r>
-      <w:proofErr w:type="spellEnd"/>
-      <w:r>
-        <w:rPr>
-          <w:i/>
-        </w:rPr>
-        <w:t xml:space="preserve"> </w:t>
-      </w:r>
-      <w:proofErr w:type="spellStart"/>
-      <w:r>
-        <w:rPr>
-          <w:i/>
-        </w:rPr>
-        <w:t>prikupljati</w:t>
-      </w:r>
-      <w:proofErr w:type="spellEnd"/>
-      <w:r>
-        <w:rPr>
-          <w:i/>
-        </w:rPr>
-        <w:t xml:space="preserve"> </w:t>
-      </w:r>
-      <w:proofErr w:type="spellStart"/>
-      <w:r>
-        <w:rPr>
-          <w:i/>
-        </w:rPr>
-        <w:t>i</w:t>
-      </w:r>
-      <w:proofErr w:type="spellEnd"/>
-      <w:r>
-        <w:rPr>
-          <w:i/>
-        </w:rPr>
-        <w:t xml:space="preserve"> </w:t>
-      </w:r>
-      <w:proofErr w:type="spellStart"/>
-      <w:r>
-        <w:rPr>
-          <w:i/>
-        </w:rPr>
-        <w:t>analizirati</w:t>
-      </w:r>
-      <w:proofErr w:type="spellEnd"/>
-      <w:r>
-        <w:rPr>
-          <w:i/>
-        </w:rPr>
-        <w:t xml:space="preserve"> </w:t>
-      </w:r>
-      <w:proofErr w:type="spellStart"/>
-      <w:r>
-        <w:rPr>
-          <w:i/>
-        </w:rPr>
-        <w:t>kako</w:t>
-      </w:r>
-      <w:proofErr w:type="spellEnd"/>
-      <w:r>
-        <w:rPr>
-          <w:i/>
-        </w:rPr>
-        <w:t xml:space="preserve"> bi se </w:t>
-      </w:r>
-      <w:proofErr w:type="spellStart"/>
-      <w:r>
-        <w:rPr>
-          <w:i/>
-        </w:rPr>
-        <w:t>riješio</w:t>
-      </w:r>
-      <w:proofErr w:type="spellEnd"/>
-      <w:r>
-        <w:rPr>
-          <w:i/>
-        </w:rPr>
-        <w:t xml:space="preserve"> problem.</w:t>
-      </w:r>
-      <w:r>
-        <w:t>]</w:t>
-      </w:r>
     </w:p>
     <w:p>
       <w:pPr>
@@ -1993,7 +1559,6 @@
       <w:bookmarkEnd w:id="3"/>
       <w:proofErr w:type="spellStart"/>
       <w:r>
-        <w:lastRenderedPageBreak/>
         <w:t>Obrada</w:t>
       </w:r>
       <w:proofErr w:type="spellEnd"/>
@@ -2135,21 +1700,7 @@
         <w:rPr>
           <w:lang w:val="en-US"/>
         </w:rPr>
-        <w:t xml:space="preserve"> </w:t>
-      </w:r>
-      <w:proofErr w:type="spellStart"/>
-      <w:r>
-        <w:rPr>
-          <w:lang w:val="en-US"/>
-        </w:rPr>
-        <w:t>i</w:t>
-      </w:r>
-      <w:proofErr w:type="spellEnd"/>
-      <w:r>
-        <w:rPr>
-          <w:lang w:val="en-US"/>
-        </w:rPr>
-        <w:t xml:space="preserve"> </w:t>
+        <w:t xml:space="preserve"> i </w:t>
       </w:r>
       <w:proofErr w:type="spellStart"/>
       <w:r>
@@ -2190,6 +1741,7 @@
         <w:rPr>
           <w:lang w:val="en-US"/>
         </w:rPr>
+        <w:lastRenderedPageBreak/>
         <w:t>povezane</w:t>
       </w:r>
       <w:proofErr w:type="spellEnd"/>
@@ -4556,6 +4108,7 @@
   <w:style w:type="character" w:default="1" w:styleId="DefaultParagraphFont">
     <w:name w:val="Default Paragraph Font"/>
     <w:uiPriority w:val="1"/>
+    <w:semiHidden/>
     <w:unhideWhenUsed/>
   </w:style>
   <w:style w:type="table" w:default="1" w:styleId="TableNormal">

</xml_diff>